<commit_message>
Clean up leftover placeholder files and gitignore
.gitkeep files are no longer needed now that notebooks/ and src/ have real
content; also picked up a stray .gitignore edit (.preview/) and the SOP docx
regenerated after the section 9 wording fix.
</commit_message>
<xml_diff>
--- a/docs/SOP-QA-012_Deviation-and-CAPA-Management.docx
+++ b/docs/SOP-QA-012_Deviation-and-CAPA-Management.docx
@@ -3657,7 +3657,7 @@
           <w:i w:val="0"/>
           <w:sz w:val="21"/>
         </w:rPr>
-        <w:t>For deviations classified Critical at Initial Assessment, the Site Quality Manager additionally convenes the Quality Council for a dedicated risk review, in parallel with or immediately following CAPA Proposed (Section 8.5), per the Quality Council Charter (SOP-QA-014). This escalation is governed by SOP-QA-014 and is not itself a stage of the process defined in Section 7.</w:t>
+        <w:t>For deviations classified Critical at Initial Assessment, the Site Quality Manager additionally convenes the Quality Council for a dedicated risk review, logged in the case record as a “Quality Council Review” event, in parallel with or immediately following CAPA Proposed (Section 8.5), per the Quality Council Charter (SOP-QA-014). This escalation is governed by SOP-QA-014 and is not itself a stage of the process defined in Section 7.</w:t>
       </w:r>
     </w:p>
     <w:p>
@@ -3699,7 +3699,7 @@
           <w:i w:val="0"/>
           <w:sz w:val="21"/>
         </w:rPr>
-        <w:t>A Closed case may only be reopened via a documented Deviation Reopening Request, approved by the Site Quality Manager, where new information indicates the root cause was not adequately addressed or a recurrence has occurred. A reopened case re-enters the process at Root Cause Analysis (Section 8.4) and follows the standard flow described in Section 8 through to closure.</w:t>
+        <w:t>A Closed case may only be reopened via a documented Deviation Reopening Request, approved by the Site Quality Manager, where new information indicates the root cause was not adequately addressed or a recurrence has occurred. Once approved, the case record is logged with a “Deviation Reopened” event and re-enters the process at Root Cause Analysis (Section 8.4), following the standard flow described in Section 8 through to closure.</w:t>
       </w:r>
     </w:p>
     <w:p>

</xml_diff>